<commit_message>
DATA780: through Weed 08
</commit_message>
<xml_diff>
--- a/notes/Spring_2026/DATA780/Week03/docx/DATA780_week03_notes.docx
+++ b/notes/Spring_2026/DATA780/Week03/docx/DATA780_week03_notes.docx
@@ -31438,475 +31438,6 @@
                 </mc:Fallback>
               </mc:AlternateContent>
             </w:r>
-          </w:p>
-        </w:tc>
-      </w:tr>
-      <w:tr>
-        <w:trPr>
-          <w:trHeight w:val="4209"/>
-        </w:trPr>
-        <w:tc>
-          <w:tcPr>
-            <w:cnfStyle w:val="001000000000" w:firstRow="0" w:lastRow="0" w:firstColumn="1" w:lastColumn="0" w:oddVBand="0" w:evenVBand="0" w:oddHBand="0" w:evenHBand="0" w:firstRowFirstColumn="0" w:firstRowLastColumn="0" w:lastRowFirstColumn="0" w:lastRowLastColumn="0"/>
-            <w:tcW w:w="2065" w:type="dxa"/>
-            <w:shd w:val="clear" w:color="auto" w:fill="D9D9D9" w:themeFill="background1" w:themeFillShade="D9"/>
-          </w:tcPr>
-          <w:p>
-            <w:pPr>
-              <w:spacing w:line="360" w:lineRule="auto"/>
-              <w:rPr>
-                <w:color w:val="80340D" w:themeColor="accent2" w:themeShade="80"/>
-              </w:rPr>
-            </w:pPr>
-            <w:r>
-              <w:rPr>
-                <w:color w:val="80340D" w:themeColor="accent2" w:themeShade="80"/>
-              </w:rPr>
-              <w:lastRenderedPageBreak/>
-              <w:t>Regularization to Prevent Overfitting</w:t>
-            </w:r>
-          </w:p>
-        </w:tc>
-        <w:tc>
-          <w:tcPr>
-            <w:tcW w:w="7416" w:type="dxa"/>
-            <w:shd w:val="clear" w:color="auto" w:fill="FFFFFF" w:themeFill="background1"/>
-          </w:tcPr>
-          <w:p>
-            <w:pPr>
-              <w:pStyle w:val="ListParagraph"/>
-              <w:numPr>
-                <w:ilvl w:val="0"/>
-                <w:numId w:val="2"/>
-              </w:numPr>
-              <w:spacing w:line="360" w:lineRule="auto"/>
-              <w:cnfStyle w:val="000000000000" w:firstRow="0" w:lastRow="0" w:firstColumn="0" w:lastColumn="0" w:oddVBand="0" w:evenVBand="0" w:oddHBand="0" w:evenHBand="0" w:firstRowFirstColumn="0" w:firstRowLastColumn="0" w:lastRowFirstColumn="0" w:lastRowLastColumn="0"/>
-              <w:rPr>
-                <w:b/>
-                <w:bCs/>
-              </w:rPr>
-            </w:pPr>
-          </w:p>
-        </w:tc>
-      </w:tr>
-    </w:tbl>
-    <w:p>
-      <w:pPr>
-        <w:spacing w:line="360" w:lineRule="auto"/>
-      </w:pPr>
-      <w:r>
-        <w:br w:type="page"/>
-      </w:r>
-    </w:p>
-    <w:tbl>
-      <w:tblPr>
-        <w:tblStyle w:val="GridTable1Light-Accent1"/>
-        <w:tblW w:w="9481" w:type="dxa"/>
-        <w:tblCellMar>
-          <w:top w:w="29" w:type="dxa"/>
-          <w:bottom w:w="29" w:type="dxa"/>
-        </w:tblCellMar>
-        <w:tblLook w:val="04A0" w:firstRow="1" w:lastRow="0" w:firstColumn="1" w:lastColumn="0" w:noHBand="0" w:noVBand="1"/>
-      </w:tblPr>
-      <w:tblGrid>
-        <w:gridCol w:w="2065"/>
-        <w:gridCol w:w="2675"/>
-        <w:gridCol w:w="4741"/>
-      </w:tblGrid>
-      <w:tr>
-        <w:trPr>
-          <w:cnfStyle w:val="100000000000" w:firstRow="1" w:lastRow="0" w:firstColumn="0" w:lastColumn="0" w:oddVBand="0" w:evenVBand="0" w:oddHBand="0" w:evenHBand="0" w:firstRowFirstColumn="0" w:firstRowLastColumn="0" w:lastRowFirstColumn="0" w:lastRowLastColumn="0"/>
-          <w:trHeight w:val="323"/>
-        </w:trPr>
-        <w:tc>
-          <w:tcPr>
-            <w:cnfStyle w:val="001000000000" w:firstRow="0" w:lastRow="0" w:firstColumn="1" w:lastColumn="0" w:oddVBand="0" w:evenVBand="0" w:oddHBand="0" w:evenHBand="0" w:firstRowFirstColumn="0" w:firstRowLastColumn="0" w:lastRowFirstColumn="0" w:lastRowLastColumn="0"/>
-            <w:tcW w:w="4740" w:type="dxa"/>
-            <w:gridSpan w:val="2"/>
-            <w:tcBorders>
-              <w:right w:val="nil"/>
-            </w:tcBorders>
-            <w:shd w:val="clear" w:color="auto" w:fill="A5C9EB" w:themeFill="text2" w:themeFillTint="40"/>
-          </w:tcPr>
-          <w:p>
-            <w:pPr>
-              <w:tabs>
-                <w:tab w:val="right" w:pos="9229"/>
-              </w:tabs>
-              <w:spacing w:line="360" w:lineRule="auto"/>
-              <w:rPr>
-                <w:b w:val="0"/>
-                <w:bCs w:val="0"/>
-              </w:rPr>
-            </w:pPr>
-            <w:r>
-              <w:lastRenderedPageBreak/>
-              <w:t>Live Session Notes</w:t>
-            </w:r>
-          </w:p>
-        </w:tc>
-        <w:tc>
-          <w:tcPr>
-            <w:tcW w:w="4741" w:type="dxa"/>
-            <w:tcBorders>
-              <w:left w:val="nil"/>
-            </w:tcBorders>
-            <w:shd w:val="clear" w:color="auto" w:fill="A5C9EB" w:themeFill="text2" w:themeFillTint="40"/>
-          </w:tcPr>
-          <w:p>
-            <w:pPr>
-              <w:tabs>
-                <w:tab w:val="right" w:pos="9229"/>
-              </w:tabs>
-              <w:spacing w:line="360" w:lineRule="auto"/>
-              <w:jc w:val="right"/>
-              <w:cnfStyle w:val="100000000000" w:firstRow="1" w:lastRow="0" w:firstColumn="0" w:lastColumn="0" w:oddVBand="0" w:evenVBand="0" w:oddHBand="0" w:evenHBand="0" w:firstRowFirstColumn="0" w:firstRowLastColumn="0" w:lastRowFirstColumn="0" w:lastRowLastColumn="0"/>
-              <w:rPr>
-                <w:b w:val="0"/>
-                <w:bCs w:val="0"/>
-              </w:rPr>
-            </w:pPr>
-            <w:r>
-              <w:rPr>
-                <w:b w:val="0"/>
-                <w:bCs w:val="0"/>
-              </w:rPr>
-              <w:t>30 Oct 2025</w:t>
-            </w:r>
-          </w:p>
-        </w:tc>
-      </w:tr>
-      <w:tr>
-        <w:trPr>
-          <w:trHeight w:val="842"/>
-        </w:trPr>
-        <w:tc>
-          <w:tcPr>
-            <w:cnfStyle w:val="001000000000" w:firstRow="0" w:lastRow="0" w:firstColumn="1" w:lastColumn="0" w:oddVBand="0" w:evenVBand="0" w:oddHBand="0" w:evenHBand="0" w:firstRowFirstColumn="0" w:firstRowLastColumn="0" w:lastRowFirstColumn="0" w:lastRowLastColumn="0"/>
-            <w:tcW w:w="9481" w:type="dxa"/>
-            <w:gridSpan w:val="3"/>
-          </w:tcPr>
-          <w:p>
-            <w:pPr>
-              <w:spacing w:line="360" w:lineRule="auto"/>
-              <w:rPr>
-                <w:b w:val="0"/>
-                <w:bCs w:val="0"/>
-              </w:rPr>
-            </w:pPr>
-          </w:p>
-        </w:tc>
-      </w:tr>
-      <w:tr>
-        <w:trPr>
-          <w:trHeight w:val="841"/>
-        </w:trPr>
-        <w:tc>
-          <w:tcPr>
-            <w:cnfStyle w:val="001000000000" w:firstRow="0" w:lastRow="0" w:firstColumn="1" w:lastColumn="0" w:oddVBand="0" w:evenVBand="0" w:oddHBand="0" w:evenHBand="0" w:firstRowFirstColumn="0" w:firstRowLastColumn="0" w:lastRowFirstColumn="0" w:lastRowLastColumn="0"/>
-            <w:tcW w:w="2065" w:type="dxa"/>
-            <w:shd w:val="clear" w:color="auto" w:fill="D9D9D9" w:themeFill="background1" w:themeFillShade="D9"/>
-          </w:tcPr>
-          <w:p>
-            <w:pPr>
-              <w:spacing w:line="360" w:lineRule="auto"/>
-              <w:rPr>
-                <w:color w:val="80340D" w:themeColor="accent2" w:themeShade="80"/>
-              </w:rPr>
-            </w:pPr>
-            <w:r>
-              <w:rPr>
-                <w:color w:val="80340D" w:themeColor="accent2" w:themeShade="80"/>
-              </w:rPr>
-              <w:t>Project Proposal</w:t>
-            </w:r>
-          </w:p>
-        </w:tc>
-        <w:tc>
-          <w:tcPr>
-            <w:tcW w:w="7416" w:type="dxa"/>
-            <w:gridSpan w:val="2"/>
-            <w:shd w:val="clear" w:color="auto" w:fill="FFFFFF" w:themeFill="background1"/>
-          </w:tcPr>
-          <w:p>
-            <w:pPr>
-              <w:pStyle w:val="ListParagraph"/>
-              <w:numPr>
-                <w:ilvl w:val="0"/>
-                <w:numId w:val="2"/>
-              </w:numPr>
-              <w:spacing w:after="160" w:line="360" w:lineRule="auto"/>
-              <w:cnfStyle w:val="000000000000" w:firstRow="0" w:lastRow="0" w:firstColumn="0" w:lastColumn="0" w:oddVBand="0" w:evenVBand="0" w:oddHBand="0" w:evenHBand="0" w:firstRowFirstColumn="0" w:firstRowLastColumn="0" w:lastRowFirstColumn="0" w:lastRowLastColumn="0"/>
-            </w:pPr>
-            <w:r>
-              <w:t>due 02/11</w:t>
-            </w:r>
-          </w:p>
-          <w:p>
-            <w:pPr>
-              <w:pStyle w:val="ListParagraph"/>
-              <w:numPr>
-                <w:ilvl w:val="0"/>
-                <w:numId w:val="2"/>
-              </w:numPr>
-              <w:spacing w:after="160" w:line="360" w:lineRule="auto"/>
-              <w:cnfStyle w:val="000000000000" w:firstRow="0" w:lastRow="0" w:firstColumn="0" w:lastColumn="0" w:oddVBand="0" w:evenVBand="0" w:oddHBand="0" w:evenHBand="0" w:firstRowFirstColumn="0" w:firstRowLastColumn="0" w:lastRowFirstColumn="0" w:lastRowLastColumn="0"/>
-              <w:rPr>
-                <w:color w:val="A02B93" w:themeColor="accent5"/>
-              </w:rPr>
-            </w:pPr>
-            <w:r>
-              <w:rPr>
-                <w:color w:val="A02B93" w:themeColor="accent5"/>
-              </w:rPr>
-              <w:t>deliverables</w:t>
-            </w:r>
-          </w:p>
-          <w:p>
-            <w:pPr>
-              <w:pStyle w:val="ListParagraph"/>
-              <w:numPr>
-                <w:ilvl w:val="1"/>
-                <w:numId w:val="2"/>
-              </w:numPr>
-              <w:spacing w:after="160" w:line="360" w:lineRule="auto"/>
-              <w:cnfStyle w:val="000000000000" w:firstRow="0" w:lastRow="0" w:firstColumn="0" w:lastColumn="0" w:oddVBand="0" w:evenVBand="0" w:oddHBand="0" w:evenHBand="0" w:firstRowFirstColumn="0" w:firstRowLastColumn="0" w:lastRowFirstColumn="0" w:lastRowLastColumn="0"/>
-            </w:pPr>
-            <w:r>
-              <w:t xml:space="preserve"> </w:t>
-            </w:r>
-            <w:r>
-              <w:t>state the task</w:t>
-            </w:r>
-          </w:p>
-          <w:p>
-            <w:pPr>
-              <w:pStyle w:val="ListParagraph"/>
-              <w:numPr>
-                <w:ilvl w:val="1"/>
-                <w:numId w:val="2"/>
-              </w:numPr>
-              <w:spacing w:after="160" w:line="360" w:lineRule="auto"/>
-              <w:cnfStyle w:val="000000000000" w:firstRow="0" w:lastRow="0" w:firstColumn="0" w:lastColumn="0" w:oddVBand="0" w:evenVBand="0" w:oddHBand="0" w:evenHBand="0" w:firstRowFirstColumn="0" w:firstRowLastColumn="0" w:lastRowFirstColumn="0" w:lastRowLastColumn="0"/>
-            </w:pPr>
-            <w:r>
-              <w:t>state the goals</w:t>
-            </w:r>
-          </w:p>
-        </w:tc>
-      </w:tr>
-      <w:tr>
-        <w:trPr>
-          <w:trHeight w:val="841"/>
-        </w:trPr>
-        <w:tc>
-          <w:tcPr>
-            <w:cnfStyle w:val="001000000000" w:firstRow="0" w:lastRow="0" w:firstColumn="1" w:lastColumn="0" w:oddVBand="0" w:evenVBand="0" w:oddHBand="0" w:evenHBand="0" w:firstRowFirstColumn="0" w:firstRowLastColumn="0" w:lastRowFirstColumn="0" w:lastRowLastColumn="0"/>
-            <w:tcW w:w="2065" w:type="dxa"/>
-            <w:shd w:val="clear" w:color="auto" w:fill="D9D9D9" w:themeFill="background1" w:themeFillShade="D9"/>
-          </w:tcPr>
-          <w:p>
-            <w:pPr>
-              <w:spacing w:line="360" w:lineRule="auto"/>
-              <w:rPr>
-                <w:color w:val="80340D" w:themeColor="accent2" w:themeShade="80"/>
-              </w:rPr>
-            </w:pPr>
-            <w:r>
-              <w:rPr>
-                <w:color w:val="80340D" w:themeColor="accent2" w:themeShade="80"/>
-              </w:rPr>
-              <w:t>*</w:t>
-            </w:r>
-          </w:p>
-        </w:tc>
-        <w:tc>
-          <w:tcPr>
-            <w:tcW w:w="7416" w:type="dxa"/>
-            <w:gridSpan w:val="2"/>
-            <w:shd w:val="clear" w:color="auto" w:fill="FFFFFF" w:themeFill="background1"/>
-          </w:tcPr>
-          <w:p>
-            <w:pPr>
-              <w:pStyle w:val="ListParagraph"/>
-              <w:numPr>
-                <w:ilvl w:val="0"/>
-                <w:numId w:val="2"/>
-              </w:numPr>
-              <w:spacing w:after="160" w:line="360" w:lineRule="auto"/>
-              <w:cnfStyle w:val="000000000000" w:firstRow="0" w:lastRow="0" w:firstColumn="0" w:lastColumn="0" w:oddVBand="0" w:evenVBand="0" w:oddHBand="0" w:evenHBand="0" w:firstRowFirstColumn="0" w:firstRowLastColumn="0" w:lastRowFirstColumn="0" w:lastRowLastColumn="0"/>
-              <w:rPr>
-                <w:color w:val="A02B93" w:themeColor="accent5"/>
-              </w:rPr>
-            </w:pPr>
-          </w:p>
-          <w:p>
-            <w:pPr>
-              <w:pStyle w:val="ListParagraph"/>
-              <w:numPr>
-                <w:ilvl w:val="0"/>
-                <w:numId w:val="2"/>
-              </w:numPr>
-              <w:spacing w:after="160" w:line="360" w:lineRule="auto"/>
-              <w:cnfStyle w:val="000000000000" w:firstRow="0" w:lastRow="0" w:firstColumn="0" w:lastColumn="0" w:oddVBand="0" w:evenVBand="0" w:oddHBand="0" w:evenHBand="0" w:firstRowFirstColumn="0" w:firstRowLastColumn="0" w:lastRowFirstColumn="0" w:lastRowLastColumn="0"/>
-            </w:pPr>
-          </w:p>
-          <w:p>
-            <w:pPr>
-              <w:pStyle w:val="ListParagraph"/>
-              <w:numPr>
-                <w:ilvl w:val="0"/>
-                <w:numId w:val="2"/>
-              </w:numPr>
-              <w:spacing w:after="160" w:line="360" w:lineRule="auto"/>
-              <w:cnfStyle w:val="000000000000" w:firstRow="0" w:lastRow="0" w:firstColumn="0" w:lastColumn="0" w:oddVBand="0" w:evenVBand="0" w:oddHBand="0" w:evenHBand="0" w:firstRowFirstColumn="0" w:firstRowLastColumn="0" w:lastRowFirstColumn="0" w:lastRowLastColumn="0"/>
-              <w:rPr>
-                <w:color w:val="A02B93" w:themeColor="accent5"/>
-              </w:rPr>
-            </w:pPr>
-          </w:p>
-        </w:tc>
-      </w:tr>
-      <w:tr>
-        <w:trPr>
-          <w:trHeight w:val="841"/>
-        </w:trPr>
-        <w:tc>
-          <w:tcPr>
-            <w:cnfStyle w:val="001000000000" w:firstRow="0" w:lastRow="0" w:firstColumn="1" w:lastColumn="0" w:oddVBand="0" w:evenVBand="0" w:oddHBand="0" w:evenHBand="0" w:firstRowFirstColumn="0" w:firstRowLastColumn="0" w:lastRowFirstColumn="0" w:lastRowLastColumn="0"/>
-            <w:tcW w:w="2065" w:type="dxa"/>
-            <w:shd w:val="clear" w:color="auto" w:fill="D9D9D9" w:themeFill="background1" w:themeFillShade="D9"/>
-          </w:tcPr>
-          <w:p>
-            <w:pPr>
-              <w:spacing w:line="360" w:lineRule="auto"/>
-              <w:rPr>
-                <w:color w:val="80340D" w:themeColor="accent2" w:themeShade="80"/>
-              </w:rPr>
-            </w:pPr>
-            <w:r>
-              <w:rPr>
-                <w:color w:val="80340D" w:themeColor="accent2" w:themeShade="80"/>
-              </w:rPr>
-              <w:t>*</w:t>
-            </w:r>
-          </w:p>
-        </w:tc>
-        <w:tc>
-          <w:tcPr>
-            <w:tcW w:w="7416" w:type="dxa"/>
-            <w:gridSpan w:val="2"/>
-            <w:shd w:val="clear" w:color="auto" w:fill="FFFFFF" w:themeFill="background1"/>
-          </w:tcPr>
-          <w:p>
-            <w:pPr>
-              <w:pStyle w:val="ListParagraph"/>
-              <w:numPr>
-                <w:ilvl w:val="0"/>
-                <w:numId w:val="2"/>
-              </w:numPr>
-              <w:spacing w:after="160" w:line="360" w:lineRule="auto"/>
-              <w:cnfStyle w:val="000000000000" w:firstRow="0" w:lastRow="0" w:firstColumn="0" w:lastColumn="0" w:oddVBand="0" w:evenVBand="0" w:oddHBand="0" w:evenHBand="0" w:firstRowFirstColumn="0" w:firstRowLastColumn="0" w:lastRowFirstColumn="0" w:lastRowLastColumn="0"/>
-            </w:pPr>
-          </w:p>
-          <w:p>
-            <w:pPr>
-              <w:pStyle w:val="ListParagraph"/>
-              <w:numPr>
-                <w:ilvl w:val="0"/>
-                <w:numId w:val="2"/>
-              </w:numPr>
-              <w:spacing w:after="160" w:line="360" w:lineRule="auto"/>
-              <w:cnfStyle w:val="000000000000" w:firstRow="0" w:lastRow="0" w:firstColumn="0" w:lastColumn="0" w:oddVBand="0" w:evenVBand="0" w:oddHBand="0" w:evenHBand="0" w:firstRowFirstColumn="0" w:firstRowLastColumn="0" w:lastRowFirstColumn="0" w:lastRowLastColumn="0"/>
-              <w:rPr>
-                <w:color w:val="A02B93" w:themeColor="accent5"/>
-              </w:rPr>
-            </w:pPr>
-          </w:p>
-          <w:p>
-            <w:pPr>
-              <w:pStyle w:val="ListParagraph"/>
-              <w:numPr>
-                <w:ilvl w:val="0"/>
-                <w:numId w:val="2"/>
-              </w:numPr>
-              <w:spacing w:line="360" w:lineRule="auto"/>
-              <w:cnfStyle w:val="000000000000" w:firstRow="0" w:lastRow="0" w:firstColumn="0" w:lastColumn="0" w:oddVBand="0" w:evenVBand="0" w:oddHBand="0" w:evenHBand="0" w:firstRowFirstColumn="0" w:firstRowLastColumn="0" w:lastRowFirstColumn="0" w:lastRowLastColumn="0"/>
-            </w:pPr>
-          </w:p>
-        </w:tc>
-      </w:tr>
-      <w:tr>
-        <w:trPr>
-          <w:trHeight w:val="841"/>
-        </w:trPr>
-        <w:tc>
-          <w:tcPr>
-            <w:cnfStyle w:val="001000000000" w:firstRow="0" w:lastRow="0" w:firstColumn="1" w:lastColumn="0" w:oddVBand="0" w:evenVBand="0" w:oddHBand="0" w:evenHBand="0" w:firstRowFirstColumn="0" w:firstRowLastColumn="0" w:lastRowFirstColumn="0" w:lastRowLastColumn="0"/>
-            <w:tcW w:w="2065" w:type="dxa"/>
-            <w:shd w:val="clear" w:color="auto" w:fill="D9D9D9" w:themeFill="background1" w:themeFillShade="D9"/>
-          </w:tcPr>
-          <w:p>
-            <w:pPr>
-              <w:spacing w:line="360" w:lineRule="auto"/>
-              <w:rPr>
-                <w:color w:val="80340D" w:themeColor="accent2" w:themeShade="80"/>
-              </w:rPr>
-            </w:pPr>
-            <w:bookmarkStart w:id="0" w:name="_Hlk212737342"/>
-            <w:r>
-              <w:rPr>
-                <w:color w:val="80340D" w:themeColor="accent2" w:themeShade="80"/>
-              </w:rPr>
-              <w:t>*</w:t>
-            </w:r>
-            <w:bookmarkEnd w:id="0"/>
-          </w:p>
-        </w:tc>
-        <w:tc>
-          <w:tcPr>
-            <w:tcW w:w="7416" w:type="dxa"/>
-            <w:gridSpan w:val="2"/>
-            <w:shd w:val="clear" w:color="auto" w:fill="FFFFFF" w:themeFill="background1"/>
-          </w:tcPr>
-          <w:p>
-            <w:pPr>
-              <w:pStyle w:val="ListParagraph"/>
-              <w:numPr>
-                <w:ilvl w:val="0"/>
-                <w:numId w:val="2"/>
-              </w:numPr>
-              <w:spacing w:after="160" w:line="360" w:lineRule="auto"/>
-              <w:cnfStyle w:val="000000000000" w:firstRow="0" w:lastRow="0" w:firstColumn="0" w:lastColumn="0" w:oddVBand="0" w:evenVBand="0" w:oddHBand="0" w:evenHBand="0" w:firstRowFirstColumn="0" w:firstRowLastColumn="0" w:lastRowFirstColumn="0" w:lastRowLastColumn="0"/>
-              <w:rPr>
-                <w:color w:val="A02B93" w:themeColor="accent5"/>
-              </w:rPr>
-            </w:pPr>
-          </w:p>
-          <w:p>
-            <w:pPr>
-              <w:pStyle w:val="ListParagraph"/>
-              <w:numPr>
-                <w:ilvl w:val="0"/>
-                <w:numId w:val="2"/>
-              </w:numPr>
-              <w:spacing w:after="160" w:line="360" w:lineRule="auto"/>
-              <w:cnfStyle w:val="000000000000" w:firstRow="0" w:lastRow="0" w:firstColumn="0" w:lastColumn="0" w:oddVBand="0" w:evenVBand="0" w:oddHBand="0" w:evenHBand="0" w:firstRowFirstColumn="0" w:firstRowLastColumn="0" w:lastRowFirstColumn="0" w:lastRowLastColumn="0"/>
-            </w:pPr>
-          </w:p>
-          <w:p>
-            <w:pPr>
-              <w:pStyle w:val="ListParagraph"/>
-              <w:numPr>
-                <w:ilvl w:val="0"/>
-                <w:numId w:val="2"/>
-              </w:numPr>
-              <w:spacing w:after="160" w:line="360" w:lineRule="auto"/>
-              <w:cnfStyle w:val="000000000000" w:firstRow="0" w:lastRow="0" w:firstColumn="0" w:lastColumn="0" w:oddVBand="0" w:evenVBand="0" w:oddHBand="0" w:evenHBand="0" w:firstRowFirstColumn="0" w:firstRowLastColumn="0" w:lastRowFirstColumn="0" w:lastRowLastColumn="0"/>
-              <w:rPr>
-                <w:color w:val="A02B93" w:themeColor="accent5"/>
-              </w:rPr>
-            </w:pPr>
           </w:p>
         </w:tc>
       </w:tr>
@@ -34928,7 +34459,7 @@
     </inkml:brush>
   </inkml:definitions>
   <inkml:trace contextRef="#ctx0" brushRef="#br0">1 80 9830,'0'-5'0,"0"-5"0,0-2 0</inkml:trace>
-  <inkml:trace contextRef="#ctx0" brushRef="#br0" timeOffset="291.97">54 1 9830,'0'0'0</inkml:trace>
+  <inkml:trace contextRef="#ctx0" brushRef="#br0" timeOffset="291.96">54 1 9830,'0'0'0</inkml:trace>
 </inkml:ink>
 </file>
 

</xml_diff>